<commit_message>
Approval layers (decision 0031): Chapters 1-6 revision pending script review; audio 1-9 outdated
Joshua, 2026-10-06: presentation, story/script and audio are approved
separately. The portrait-and-name presentation is approved; it approves
no chapter text.

- Chapters 1-6: review_status approved -> revision-pending, with
  last_approved_revision 93ac65a (approved 2026-09-21). 7-9 stay
  in-review. audio_status outdated for 1-9.
- reviews/script-revision-2026-10-06.md: all 52 changed passages,
  before and after, for script review.
- CHAPTER_INDEX rows describe the approved revision again (word counts
  restored) and say a newer revision is pending.
- Reader badges: "revision pending script review", "audio: outdated".
- WORKFLOW, CLAUDE.md, STORY_OVERVIEW, chapter template, Word files.

Co-Authored-By: Claude Opus 5.5 <noreply@anthropic.com>
Claude-Session: https://claude.ai/code/session_01EJ3GMtHm1zruGuc3sPX6WD
</commit_message>
<xml_diff>
--- a/manuscripts/01-03 Chapters - TRADDOMIUM Micro Battle.docx
+++ b/manuscripts/01-03 Chapters - TRADDOMIUM Micro Battle.docx
@@ -14,6 +14,12 @@
       <w:pPr/>
       <w:r>
         <w:t>Chapters 1-3</w:t>
+      </w:r>
+    </w:p>
+    <w:p>
+      <w:pPr/>
+      <w:r>
+        <w:t>🟡 REVISION PENDING SCRIPT REVIEW — 2026-10-06 dialogue-attribution revision. Last approved text: revision 93ac65a.</w:t>
       </w:r>
     </w:p>
     <w:p>

</xml_diff>